<commit_message>
Add rerun evaluation data to docs
</commit_message>
<xml_diff>
--- a/Ollama_RAG_课程设计完整操作步骤.docx
+++ b/Ollama_RAG_课程设计完整操作步骤.docx
@@ -15025,6 +15025,2240 @@
       </w:tr>
     </w:tbl>
     <w:p/>
+    <w:p>
+      <w:pPr>
+        <w:pStyle w:val="Heading1"/>
+      </w:pPr>
+      <w:r>
+        <w:rPr>
+          <w:rFonts w:ascii="Microsoft YaHei" w:hAnsi="Microsoft YaHei" w:eastAsia="Microsoft YaHei"/>
+          <w:b/>
+          <w:sz w:val="28"/>
+        </w:rPr>
+        <w:t>十五、新旧两组完整评测数据补充</w:t>
+      </w:r>
+    </w:p>
+    <w:p>
+      <w:r>
+        <w:rPr>
+          <w:rFonts w:ascii="Microsoft YaHei" w:hAnsi="Microsoft YaHei" w:eastAsia="Microsoft YaHei"/>
+          <w:b w:val="0"/>
+          <w:sz w:val="21"/>
+        </w:rPr>
+        <w:t>本节在不删除原有实验数据的前提下，追加 2026-05-23 重新完整流程实验结果。两组数据均用于说明项目具备可复现的评测链路；其中 RAG 策略对照实验固定知识库、30 条评测问题、模型 qwen2.5:7b-instruct-q4_K_M 和 Top-K=4，只切换检索策略。</w:t>
+      </w:r>
+    </w:p>
+    <w:p>
+      <w:pPr>
+        <w:pStyle w:val="Heading2"/>
+      </w:pPr>
+      <w:r>
+        <w:rPr>
+          <w:rFonts w:ascii="Microsoft YaHei" w:hAnsi="Microsoft YaHei" w:eastAsia="Microsoft YaHei"/>
+          <w:b/>
+          <w:sz w:val="24"/>
+        </w:rPr>
+        <w:t>1. 单模型 30 条评测</w:t>
+      </w:r>
+    </w:p>
+    <w:p>
+      <w:r>
+        <w:rPr>
+          <w:rFonts w:ascii="Microsoft YaHei" w:hAnsi="Microsoft YaHei" w:eastAsia="Microsoft YaHei"/>
+          <w:b w:val="0"/>
+          <w:sz w:val="21"/>
+        </w:rPr>
+        <w:t>重新完整流程实验结果（2026-05-23）如下：</w:t>
+      </w:r>
+    </w:p>
+    <w:tbl>
+      <w:tblPr>
+        <w:tblStyle w:val="TableGrid"/>
+        <w:tblW w:type="auto" w:w="0"/>
+        <w:tblLayout w:type="autofit"/>
+        <w:tblLook w:firstColumn="1" w:firstRow="1" w:lastColumn="0" w:lastRow="0" w:noHBand="0" w:noVBand="1" w:val="04A0"/>
+      </w:tblPr>
+      <w:tblGrid>
+        <w:gridCol w:w="1255"/>
+        <w:gridCol w:w="1255"/>
+        <w:gridCol w:w="1255"/>
+        <w:gridCol w:w="1255"/>
+        <w:gridCol w:w="1255"/>
+        <w:gridCol w:w="1255"/>
+        <w:gridCol w:w="1255"/>
+      </w:tblGrid>
+      <w:tr>
+        <w:tc>
+          <w:tcPr>
+            <w:tcW w:type="dxa" w:w="1255"/>
+          </w:tcPr>
+          <w:p>
+            <w:pPr>
+              <w:jc w:val="center"/>
+            </w:pPr>
+            <w:r>
+              <w:rPr>
+                <w:rFonts w:ascii="Microsoft YaHei" w:hAnsi="Microsoft YaHei" w:eastAsia="Microsoft YaHei"/>
+                <w:b/>
+                <w:sz w:val="16"/>
+              </w:rPr>
+              <w:t>样本数</w:t>
+            </w:r>
+          </w:p>
+        </w:tc>
+        <w:tc>
+          <w:tcPr>
+            <w:tcW w:type="dxa" w:w="1255"/>
+          </w:tcPr>
+          <w:p>
+            <w:pPr>
+              <w:jc w:val="center"/>
+            </w:pPr>
+            <w:r>
+              <w:rPr>
+                <w:rFonts w:ascii="Microsoft YaHei" w:hAnsi="Microsoft YaHei" w:eastAsia="Microsoft YaHei"/>
+                <w:b/>
+                <w:sz w:val="16"/>
+              </w:rPr>
+              <w:t>Top-K</w:t>
+            </w:r>
+          </w:p>
+        </w:tc>
+        <w:tc>
+          <w:tcPr>
+            <w:tcW w:type="dxa" w:w="1255"/>
+          </w:tcPr>
+          <w:p>
+            <w:pPr>
+              <w:jc w:val="center"/>
+            </w:pPr>
+            <w:r>
+              <w:rPr>
+                <w:rFonts w:ascii="Microsoft YaHei" w:hAnsi="Microsoft YaHei" w:eastAsia="Microsoft YaHei"/>
+                <w:b/>
+                <w:sz w:val="16"/>
+              </w:rPr>
+              <w:t>检索命中率</w:t>
+            </w:r>
+          </w:p>
+        </w:tc>
+        <w:tc>
+          <w:tcPr>
+            <w:tcW w:type="dxa" w:w="1255"/>
+          </w:tcPr>
+          <w:p>
+            <w:pPr>
+              <w:jc w:val="center"/>
+            </w:pPr>
+            <w:r>
+              <w:rPr>
+                <w:rFonts w:ascii="Microsoft YaHei" w:hAnsi="Microsoft YaHei" w:eastAsia="Microsoft YaHei"/>
+                <w:b/>
+                <w:sz w:val="16"/>
+              </w:rPr>
+              <w:t>平均覆盖度</w:t>
+            </w:r>
+          </w:p>
+        </w:tc>
+        <w:tc>
+          <w:tcPr>
+            <w:tcW w:type="dxa" w:w="1255"/>
+          </w:tcPr>
+          <w:p>
+            <w:pPr>
+              <w:jc w:val="center"/>
+            </w:pPr>
+            <w:r>
+              <w:rPr>
+                <w:rFonts w:ascii="Microsoft YaHei" w:hAnsi="Microsoft YaHei" w:eastAsia="Microsoft YaHei"/>
+                <w:b/>
+                <w:sz w:val="16"/>
+              </w:rPr>
+              <w:t>平均检索耗时</w:t>
+            </w:r>
+          </w:p>
+        </w:tc>
+        <w:tc>
+          <w:tcPr>
+            <w:tcW w:type="dxa" w:w="1255"/>
+          </w:tcPr>
+          <w:p>
+            <w:pPr>
+              <w:jc w:val="center"/>
+            </w:pPr>
+            <w:r>
+              <w:rPr>
+                <w:rFonts w:ascii="Microsoft YaHei" w:hAnsi="Microsoft YaHei" w:eastAsia="Microsoft YaHei"/>
+                <w:b/>
+                <w:sz w:val="16"/>
+              </w:rPr>
+              <w:t>平均生成耗时</w:t>
+            </w:r>
+          </w:p>
+        </w:tc>
+        <w:tc>
+          <w:tcPr>
+            <w:tcW w:type="dxa" w:w="1255"/>
+          </w:tcPr>
+          <w:p>
+            <w:pPr>
+              <w:jc w:val="center"/>
+            </w:pPr>
+            <w:r>
+              <w:rPr>
+                <w:rFonts w:ascii="Microsoft YaHei" w:hAnsi="Microsoft YaHei" w:eastAsia="Microsoft YaHei"/>
+                <w:b/>
+                <w:sz w:val="16"/>
+              </w:rPr>
+              <w:t>平均总耗时</w:t>
+            </w:r>
+          </w:p>
+        </w:tc>
+      </w:tr>
+      <w:tr>
+        <w:tc>
+          <w:tcPr>
+            <w:tcW w:type="dxa" w:w="1255"/>
+          </w:tcPr>
+          <w:p>
+            <w:pPr>
+              <w:jc w:val="center"/>
+            </w:pPr>
+            <w:r>
+              <w:rPr>
+                <w:rFonts w:ascii="Microsoft YaHei" w:hAnsi="Microsoft YaHei" w:eastAsia="Microsoft YaHei"/>
+                <w:b w:val="0"/>
+                <w:sz w:val="16"/>
+              </w:rPr>
+              <w:t>30</w:t>
+            </w:r>
+          </w:p>
+        </w:tc>
+        <w:tc>
+          <w:tcPr>
+            <w:tcW w:type="dxa" w:w="1255"/>
+          </w:tcPr>
+          <w:p>
+            <w:pPr>
+              <w:jc w:val="center"/>
+            </w:pPr>
+            <w:r>
+              <w:rPr>
+                <w:rFonts w:ascii="Microsoft YaHei" w:hAnsi="Microsoft YaHei" w:eastAsia="Microsoft YaHei"/>
+                <w:b w:val="0"/>
+                <w:sz w:val="16"/>
+              </w:rPr>
+              <w:t>4</w:t>
+            </w:r>
+          </w:p>
+        </w:tc>
+        <w:tc>
+          <w:tcPr>
+            <w:tcW w:type="dxa" w:w="1255"/>
+          </w:tcPr>
+          <w:p>
+            <w:pPr>
+              <w:jc w:val="center"/>
+            </w:pPr>
+            <w:r>
+              <w:rPr>
+                <w:rFonts w:ascii="Microsoft YaHei" w:hAnsi="Microsoft YaHei" w:eastAsia="Microsoft YaHei"/>
+                <w:b w:val="0"/>
+                <w:sz w:val="16"/>
+              </w:rPr>
+              <w:t>1.0000</w:t>
+            </w:r>
+          </w:p>
+        </w:tc>
+        <w:tc>
+          <w:tcPr>
+            <w:tcW w:type="dxa" w:w="1255"/>
+          </w:tcPr>
+          <w:p>
+            <w:pPr>
+              <w:jc w:val="center"/>
+            </w:pPr>
+            <w:r>
+              <w:rPr>
+                <w:rFonts w:ascii="Microsoft YaHei" w:hAnsi="Microsoft YaHei" w:eastAsia="Microsoft YaHei"/>
+                <w:b w:val="0"/>
+                <w:sz w:val="16"/>
+              </w:rPr>
+              <w:t>0.6143</w:t>
+            </w:r>
+          </w:p>
+        </w:tc>
+        <w:tc>
+          <w:tcPr>
+            <w:tcW w:type="dxa" w:w="1255"/>
+          </w:tcPr>
+          <w:p>
+            <w:pPr>
+              <w:jc w:val="center"/>
+            </w:pPr>
+            <w:r>
+              <w:rPr>
+                <w:rFonts w:ascii="Microsoft YaHei" w:hAnsi="Microsoft YaHei" w:eastAsia="Microsoft YaHei"/>
+                <w:b w:val="0"/>
+                <w:sz w:val="16"/>
+              </w:rPr>
+              <w:t>0.4019s</w:t>
+            </w:r>
+          </w:p>
+        </w:tc>
+        <w:tc>
+          <w:tcPr>
+            <w:tcW w:type="dxa" w:w="1255"/>
+          </w:tcPr>
+          <w:p>
+            <w:pPr>
+              <w:jc w:val="center"/>
+            </w:pPr>
+            <w:r>
+              <w:rPr>
+                <w:rFonts w:ascii="Microsoft YaHei" w:hAnsi="Microsoft YaHei" w:eastAsia="Microsoft YaHei"/>
+                <w:b w:val="0"/>
+                <w:sz w:val="16"/>
+              </w:rPr>
+              <w:t>135.2647s</w:t>
+            </w:r>
+          </w:p>
+        </w:tc>
+        <w:tc>
+          <w:tcPr>
+            <w:tcW w:type="dxa" w:w="1255"/>
+          </w:tcPr>
+          <w:p>
+            <w:pPr>
+              <w:jc w:val="center"/>
+            </w:pPr>
+            <w:r>
+              <w:rPr>
+                <w:rFonts w:ascii="Microsoft YaHei" w:hAnsi="Microsoft YaHei" w:eastAsia="Microsoft YaHei"/>
+                <w:b w:val="0"/>
+                <w:sz w:val="16"/>
+              </w:rPr>
+              <w:t>135.6667s</w:t>
+            </w:r>
+          </w:p>
+        </w:tc>
+      </w:tr>
+    </w:tbl>
+    <w:p/>
+    <w:p>
+      <w:pPr>
+        <w:pStyle w:val="Heading2"/>
+      </w:pPr>
+      <w:r>
+        <w:rPr>
+          <w:rFonts w:ascii="Microsoft YaHei" w:hAnsi="Microsoft YaHei" w:eastAsia="Microsoft YaHei"/>
+          <w:b/>
+          <w:sz w:val="24"/>
+        </w:rPr>
+        <w:t>2. RAG 策略优化对照</w:t>
+      </w:r>
+    </w:p>
+    <w:p>
+      <w:r>
+        <w:rPr>
+          <w:rFonts w:ascii="Microsoft YaHei" w:hAnsi="Microsoft YaHei" w:eastAsia="Microsoft YaHei"/>
+          <w:b w:val="0"/>
+          <w:sz w:val="21"/>
+        </w:rPr>
+        <w:t>首次完整实验结果如下：</w:t>
+      </w:r>
+    </w:p>
+    <w:tbl>
+      <w:tblPr>
+        <w:tblStyle w:val="TableGrid"/>
+        <w:tblW w:type="auto" w:w="0"/>
+        <w:tblLayout w:type="autofit"/>
+        <w:tblLook w:firstColumn="1" w:firstRow="1" w:lastColumn="0" w:lastRow="0" w:noHBand="0" w:noVBand="1" w:val="04A0"/>
+      </w:tblPr>
+      <w:tblGrid>
+        <w:gridCol w:w="1098"/>
+        <w:gridCol w:w="1098"/>
+        <w:gridCol w:w="1098"/>
+        <w:gridCol w:w="1098"/>
+        <w:gridCol w:w="1098"/>
+        <w:gridCol w:w="1098"/>
+        <w:gridCol w:w="1098"/>
+        <w:gridCol w:w="1098"/>
+      </w:tblGrid>
+      <w:tr>
+        <w:tc>
+          <w:tcPr>
+            <w:tcW w:type="dxa" w:w="1098"/>
+          </w:tcPr>
+          <w:p>
+            <w:pPr>
+              <w:jc w:val="center"/>
+            </w:pPr>
+            <w:r>
+              <w:rPr>
+                <w:rFonts w:ascii="Microsoft YaHei" w:hAnsi="Microsoft YaHei" w:eastAsia="Microsoft YaHei"/>
+                <w:b/>
+                <w:sz w:val="16"/>
+              </w:rPr>
+              <w:t>检索策略</w:t>
+            </w:r>
+          </w:p>
+        </w:tc>
+        <w:tc>
+          <w:tcPr>
+            <w:tcW w:type="dxa" w:w="1098"/>
+          </w:tcPr>
+          <w:p>
+            <w:pPr>
+              <w:jc w:val="center"/>
+            </w:pPr>
+            <w:r>
+              <w:rPr>
+                <w:rFonts w:ascii="Microsoft YaHei" w:hAnsi="Microsoft YaHei" w:eastAsia="Microsoft YaHei"/>
+                <w:b/>
+                <w:sz w:val="16"/>
+              </w:rPr>
+              <w:t>样本数</w:t>
+            </w:r>
+          </w:p>
+        </w:tc>
+        <w:tc>
+          <w:tcPr>
+            <w:tcW w:type="dxa" w:w="1098"/>
+          </w:tcPr>
+          <w:p>
+            <w:pPr>
+              <w:jc w:val="center"/>
+            </w:pPr>
+            <w:r>
+              <w:rPr>
+                <w:rFonts w:ascii="Microsoft YaHei" w:hAnsi="Microsoft YaHei" w:eastAsia="Microsoft YaHei"/>
+                <w:b/>
+                <w:sz w:val="16"/>
+              </w:rPr>
+              <w:t>成功率</w:t>
+            </w:r>
+          </w:p>
+        </w:tc>
+        <w:tc>
+          <w:tcPr>
+            <w:tcW w:type="dxa" w:w="1098"/>
+          </w:tcPr>
+          <w:p>
+            <w:pPr>
+              <w:jc w:val="center"/>
+            </w:pPr>
+            <w:r>
+              <w:rPr>
+                <w:rFonts w:ascii="Microsoft YaHei" w:hAnsi="Microsoft YaHei" w:eastAsia="Microsoft YaHei"/>
+                <w:b/>
+                <w:sz w:val="16"/>
+              </w:rPr>
+              <w:t>命中率</w:t>
+            </w:r>
+          </w:p>
+        </w:tc>
+        <w:tc>
+          <w:tcPr>
+            <w:tcW w:type="dxa" w:w="1098"/>
+          </w:tcPr>
+          <w:p>
+            <w:pPr>
+              <w:jc w:val="center"/>
+            </w:pPr>
+            <w:r>
+              <w:rPr>
+                <w:rFonts w:ascii="Microsoft YaHei" w:hAnsi="Microsoft YaHei" w:eastAsia="Microsoft YaHei"/>
+                <w:b/>
+                <w:sz w:val="16"/>
+              </w:rPr>
+              <w:t>平均覆盖度</w:t>
+            </w:r>
+          </w:p>
+        </w:tc>
+        <w:tc>
+          <w:tcPr>
+            <w:tcW w:type="dxa" w:w="1098"/>
+          </w:tcPr>
+          <w:p>
+            <w:pPr>
+              <w:jc w:val="center"/>
+            </w:pPr>
+            <w:r>
+              <w:rPr>
+                <w:rFonts w:ascii="Microsoft YaHei" w:hAnsi="Microsoft YaHei" w:eastAsia="Microsoft YaHei"/>
+                <w:b/>
+                <w:sz w:val="16"/>
+              </w:rPr>
+              <w:t>检索耗时</w:t>
+            </w:r>
+          </w:p>
+        </w:tc>
+        <w:tc>
+          <w:tcPr>
+            <w:tcW w:type="dxa" w:w="1098"/>
+          </w:tcPr>
+          <w:p>
+            <w:pPr>
+              <w:jc w:val="center"/>
+            </w:pPr>
+            <w:r>
+              <w:rPr>
+                <w:rFonts w:ascii="Microsoft YaHei" w:hAnsi="Microsoft YaHei" w:eastAsia="Microsoft YaHei"/>
+                <w:b/>
+                <w:sz w:val="16"/>
+              </w:rPr>
+              <w:t>生成耗时</w:t>
+            </w:r>
+          </w:p>
+        </w:tc>
+        <w:tc>
+          <w:tcPr>
+            <w:tcW w:type="dxa" w:w="1098"/>
+          </w:tcPr>
+          <w:p>
+            <w:pPr>
+              <w:jc w:val="center"/>
+            </w:pPr>
+            <w:r>
+              <w:rPr>
+                <w:rFonts w:ascii="Microsoft YaHei" w:hAnsi="Microsoft YaHei" w:eastAsia="Microsoft YaHei"/>
+                <w:b/>
+                <w:sz w:val="16"/>
+              </w:rPr>
+              <w:t>总耗时</w:t>
+            </w:r>
+          </w:p>
+        </w:tc>
+      </w:tr>
+      <w:tr>
+        <w:tc>
+          <w:tcPr>
+            <w:tcW w:type="dxa" w:w="1098"/>
+          </w:tcPr>
+          <w:p>
+            <w:pPr>
+              <w:jc w:val="center"/>
+            </w:pPr>
+            <w:r>
+              <w:rPr>
+                <w:rFonts w:ascii="Microsoft YaHei" w:hAnsi="Microsoft YaHei" w:eastAsia="Microsoft YaHei"/>
+                <w:b w:val="0"/>
+                <w:sz w:val="16"/>
+              </w:rPr>
+              <w:t>vector</w:t>
+            </w:r>
+          </w:p>
+        </w:tc>
+        <w:tc>
+          <w:tcPr>
+            <w:tcW w:type="dxa" w:w="1098"/>
+          </w:tcPr>
+          <w:p>
+            <w:pPr>
+              <w:jc w:val="center"/>
+            </w:pPr>
+            <w:r>
+              <w:rPr>
+                <w:rFonts w:ascii="Microsoft YaHei" w:hAnsi="Microsoft YaHei" w:eastAsia="Microsoft YaHei"/>
+                <w:b w:val="0"/>
+                <w:sz w:val="16"/>
+              </w:rPr>
+              <w:t>30</w:t>
+            </w:r>
+          </w:p>
+        </w:tc>
+        <w:tc>
+          <w:tcPr>
+            <w:tcW w:type="dxa" w:w="1098"/>
+          </w:tcPr>
+          <w:p>
+            <w:pPr>
+              <w:jc w:val="center"/>
+            </w:pPr>
+            <w:r>
+              <w:rPr>
+                <w:rFonts w:ascii="Microsoft YaHei" w:hAnsi="Microsoft YaHei" w:eastAsia="Microsoft YaHei"/>
+                <w:b w:val="0"/>
+                <w:sz w:val="16"/>
+              </w:rPr>
+              <w:t>1.0000</w:t>
+            </w:r>
+          </w:p>
+        </w:tc>
+        <w:tc>
+          <w:tcPr>
+            <w:tcW w:type="dxa" w:w="1098"/>
+          </w:tcPr>
+          <w:p>
+            <w:pPr>
+              <w:jc w:val="center"/>
+            </w:pPr>
+            <w:r>
+              <w:rPr>
+                <w:rFonts w:ascii="Microsoft YaHei" w:hAnsi="Microsoft YaHei" w:eastAsia="Microsoft YaHei"/>
+                <w:b w:val="0"/>
+                <w:sz w:val="16"/>
+              </w:rPr>
+              <w:t>0.7667</w:t>
+            </w:r>
+          </w:p>
+        </w:tc>
+        <w:tc>
+          <w:tcPr>
+            <w:tcW w:type="dxa" w:w="1098"/>
+          </w:tcPr>
+          <w:p>
+            <w:pPr>
+              <w:jc w:val="center"/>
+            </w:pPr>
+            <w:r>
+              <w:rPr>
+                <w:rFonts w:ascii="Microsoft YaHei" w:hAnsi="Microsoft YaHei" w:eastAsia="Microsoft YaHei"/>
+                <w:b w:val="0"/>
+                <w:sz w:val="16"/>
+              </w:rPr>
+              <w:t>0.4058</w:t>
+            </w:r>
+          </w:p>
+        </w:tc>
+        <w:tc>
+          <w:tcPr>
+            <w:tcW w:type="dxa" w:w="1098"/>
+          </w:tcPr>
+          <w:p>
+            <w:pPr>
+              <w:jc w:val="center"/>
+            </w:pPr>
+            <w:r>
+              <w:rPr>
+                <w:rFonts w:ascii="Microsoft YaHei" w:hAnsi="Microsoft YaHei" w:eastAsia="Microsoft YaHei"/>
+                <w:b w:val="0"/>
+                <w:sz w:val="16"/>
+              </w:rPr>
+              <w:t>0.4444s</w:t>
+            </w:r>
+          </w:p>
+        </w:tc>
+        <w:tc>
+          <w:tcPr>
+            <w:tcW w:type="dxa" w:w="1098"/>
+          </w:tcPr>
+          <w:p>
+            <w:pPr>
+              <w:jc w:val="center"/>
+            </w:pPr>
+            <w:r>
+              <w:rPr>
+                <w:rFonts w:ascii="Microsoft YaHei" w:hAnsi="Microsoft YaHei" w:eastAsia="Microsoft YaHei"/>
+                <w:b w:val="0"/>
+                <w:sz w:val="16"/>
+              </w:rPr>
+              <w:t>137.7124s</w:t>
+            </w:r>
+          </w:p>
+        </w:tc>
+        <w:tc>
+          <w:tcPr>
+            <w:tcW w:type="dxa" w:w="1098"/>
+          </w:tcPr>
+          <w:p>
+            <w:pPr>
+              <w:jc w:val="center"/>
+            </w:pPr>
+            <w:r>
+              <w:rPr>
+                <w:rFonts w:ascii="Microsoft YaHei" w:hAnsi="Microsoft YaHei" w:eastAsia="Microsoft YaHei"/>
+                <w:b w:val="0"/>
+                <w:sz w:val="16"/>
+              </w:rPr>
+              <w:t>138.1570s</w:t>
+            </w:r>
+          </w:p>
+        </w:tc>
+      </w:tr>
+      <w:tr>
+        <w:tc>
+          <w:tcPr>
+            <w:tcW w:type="dxa" w:w="1098"/>
+          </w:tcPr>
+          <w:p>
+            <w:pPr>
+              <w:jc w:val="center"/>
+            </w:pPr>
+            <w:r>
+              <w:rPr>
+                <w:rFonts w:ascii="Microsoft YaHei" w:hAnsi="Microsoft YaHei" w:eastAsia="Microsoft YaHei"/>
+                <w:b w:val="0"/>
+                <w:sz w:val="16"/>
+              </w:rPr>
+              <w:t>hybrid</w:t>
+            </w:r>
+          </w:p>
+        </w:tc>
+        <w:tc>
+          <w:tcPr>
+            <w:tcW w:type="dxa" w:w="1098"/>
+          </w:tcPr>
+          <w:p>
+            <w:pPr>
+              <w:jc w:val="center"/>
+            </w:pPr>
+            <w:r>
+              <w:rPr>
+                <w:rFonts w:ascii="Microsoft YaHei" w:hAnsi="Microsoft YaHei" w:eastAsia="Microsoft YaHei"/>
+                <w:b w:val="0"/>
+                <w:sz w:val="16"/>
+              </w:rPr>
+              <w:t>30</w:t>
+            </w:r>
+          </w:p>
+        </w:tc>
+        <w:tc>
+          <w:tcPr>
+            <w:tcW w:type="dxa" w:w="1098"/>
+          </w:tcPr>
+          <w:p>
+            <w:pPr>
+              <w:jc w:val="center"/>
+            </w:pPr>
+            <w:r>
+              <w:rPr>
+                <w:rFonts w:ascii="Microsoft YaHei" w:hAnsi="Microsoft YaHei" w:eastAsia="Microsoft YaHei"/>
+                <w:b w:val="0"/>
+                <w:sz w:val="16"/>
+              </w:rPr>
+              <w:t>1.0000</w:t>
+            </w:r>
+          </w:p>
+        </w:tc>
+        <w:tc>
+          <w:tcPr>
+            <w:tcW w:type="dxa" w:w="1098"/>
+          </w:tcPr>
+          <w:p>
+            <w:pPr>
+              <w:jc w:val="center"/>
+            </w:pPr>
+            <w:r>
+              <w:rPr>
+                <w:rFonts w:ascii="Microsoft YaHei" w:hAnsi="Microsoft YaHei" w:eastAsia="Microsoft YaHei"/>
+                <w:b w:val="0"/>
+                <w:sz w:val="16"/>
+              </w:rPr>
+              <w:t>1.0000</w:t>
+            </w:r>
+          </w:p>
+        </w:tc>
+        <w:tc>
+          <w:tcPr>
+            <w:tcW w:type="dxa" w:w="1098"/>
+          </w:tcPr>
+          <w:p>
+            <w:pPr>
+              <w:jc w:val="center"/>
+            </w:pPr>
+            <w:r>
+              <w:rPr>
+                <w:rFonts w:ascii="Microsoft YaHei" w:hAnsi="Microsoft YaHei" w:eastAsia="Microsoft YaHei"/>
+                <w:b w:val="0"/>
+                <w:sz w:val="16"/>
+              </w:rPr>
+              <w:t>0.5948</w:t>
+            </w:r>
+          </w:p>
+        </w:tc>
+        <w:tc>
+          <w:tcPr>
+            <w:tcW w:type="dxa" w:w="1098"/>
+          </w:tcPr>
+          <w:p>
+            <w:pPr>
+              <w:jc w:val="center"/>
+            </w:pPr>
+            <w:r>
+              <w:rPr>
+                <w:rFonts w:ascii="Microsoft YaHei" w:hAnsi="Microsoft YaHei" w:eastAsia="Microsoft YaHei"/>
+                <w:b w:val="0"/>
+                <w:sz w:val="16"/>
+              </w:rPr>
+              <w:t>0.2312s</w:t>
+            </w:r>
+          </w:p>
+        </w:tc>
+        <w:tc>
+          <w:tcPr>
+            <w:tcW w:type="dxa" w:w="1098"/>
+          </w:tcPr>
+          <w:p>
+            <w:pPr>
+              <w:jc w:val="center"/>
+            </w:pPr>
+            <w:r>
+              <w:rPr>
+                <w:rFonts w:ascii="Microsoft YaHei" w:hAnsi="Microsoft YaHei" w:eastAsia="Microsoft YaHei"/>
+                <w:b w:val="0"/>
+                <w:sz w:val="16"/>
+              </w:rPr>
+              <w:t>129.4322s</w:t>
+            </w:r>
+          </w:p>
+        </w:tc>
+        <w:tc>
+          <w:tcPr>
+            <w:tcW w:type="dxa" w:w="1098"/>
+          </w:tcPr>
+          <w:p>
+            <w:pPr>
+              <w:jc w:val="center"/>
+            </w:pPr>
+            <w:r>
+              <w:rPr>
+                <w:rFonts w:ascii="Microsoft YaHei" w:hAnsi="Microsoft YaHei" w:eastAsia="Microsoft YaHei"/>
+                <w:b w:val="0"/>
+                <w:sz w:val="16"/>
+              </w:rPr>
+              <w:t>129.6635s</w:t>
+            </w:r>
+          </w:p>
+        </w:tc>
+      </w:tr>
+    </w:tbl>
+    <w:p/>
+    <w:p>
+      <w:r>
+        <w:rPr>
+          <w:rFonts w:ascii="Microsoft YaHei" w:hAnsi="Microsoft YaHei" w:eastAsia="Microsoft YaHei"/>
+          <w:b w:val="0"/>
+          <w:sz w:val="21"/>
+        </w:rPr>
+        <w:t>重新完整流程实验结果（2026-05-23）如下：</w:t>
+      </w:r>
+    </w:p>
+    <w:tbl>
+      <w:tblPr>
+        <w:tblStyle w:val="TableGrid"/>
+        <w:tblW w:type="auto" w:w="0"/>
+        <w:tblLayout w:type="autofit"/>
+        <w:tblLook w:firstColumn="1" w:firstRow="1" w:lastColumn="0" w:lastRow="0" w:noHBand="0" w:noVBand="1" w:val="04A0"/>
+      </w:tblPr>
+      <w:tblGrid>
+        <w:gridCol w:w="1098"/>
+        <w:gridCol w:w="1098"/>
+        <w:gridCol w:w="1098"/>
+        <w:gridCol w:w="1098"/>
+        <w:gridCol w:w="1098"/>
+        <w:gridCol w:w="1098"/>
+        <w:gridCol w:w="1098"/>
+        <w:gridCol w:w="1098"/>
+      </w:tblGrid>
+      <w:tr>
+        <w:tc>
+          <w:tcPr>
+            <w:tcW w:type="dxa" w:w="1098"/>
+          </w:tcPr>
+          <w:p>
+            <w:pPr>
+              <w:jc w:val="center"/>
+            </w:pPr>
+            <w:r>
+              <w:rPr>
+                <w:rFonts w:ascii="Microsoft YaHei" w:hAnsi="Microsoft YaHei" w:eastAsia="Microsoft YaHei"/>
+                <w:b/>
+                <w:sz w:val="16"/>
+              </w:rPr>
+              <w:t>检索策略</w:t>
+            </w:r>
+          </w:p>
+        </w:tc>
+        <w:tc>
+          <w:tcPr>
+            <w:tcW w:type="dxa" w:w="1098"/>
+          </w:tcPr>
+          <w:p>
+            <w:pPr>
+              <w:jc w:val="center"/>
+            </w:pPr>
+            <w:r>
+              <w:rPr>
+                <w:rFonts w:ascii="Microsoft YaHei" w:hAnsi="Microsoft YaHei" w:eastAsia="Microsoft YaHei"/>
+                <w:b/>
+                <w:sz w:val="16"/>
+              </w:rPr>
+              <w:t>样本数</w:t>
+            </w:r>
+          </w:p>
+        </w:tc>
+        <w:tc>
+          <w:tcPr>
+            <w:tcW w:type="dxa" w:w="1098"/>
+          </w:tcPr>
+          <w:p>
+            <w:pPr>
+              <w:jc w:val="center"/>
+            </w:pPr>
+            <w:r>
+              <w:rPr>
+                <w:rFonts w:ascii="Microsoft YaHei" w:hAnsi="Microsoft YaHei" w:eastAsia="Microsoft YaHei"/>
+                <w:b/>
+                <w:sz w:val="16"/>
+              </w:rPr>
+              <w:t>成功率</w:t>
+            </w:r>
+          </w:p>
+        </w:tc>
+        <w:tc>
+          <w:tcPr>
+            <w:tcW w:type="dxa" w:w="1098"/>
+          </w:tcPr>
+          <w:p>
+            <w:pPr>
+              <w:jc w:val="center"/>
+            </w:pPr>
+            <w:r>
+              <w:rPr>
+                <w:rFonts w:ascii="Microsoft YaHei" w:hAnsi="Microsoft YaHei" w:eastAsia="Microsoft YaHei"/>
+                <w:b/>
+                <w:sz w:val="16"/>
+              </w:rPr>
+              <w:t>命中率</w:t>
+            </w:r>
+          </w:p>
+        </w:tc>
+        <w:tc>
+          <w:tcPr>
+            <w:tcW w:type="dxa" w:w="1098"/>
+          </w:tcPr>
+          <w:p>
+            <w:pPr>
+              <w:jc w:val="center"/>
+            </w:pPr>
+            <w:r>
+              <w:rPr>
+                <w:rFonts w:ascii="Microsoft YaHei" w:hAnsi="Microsoft YaHei" w:eastAsia="Microsoft YaHei"/>
+                <w:b/>
+                <w:sz w:val="16"/>
+              </w:rPr>
+              <w:t>平均覆盖度</w:t>
+            </w:r>
+          </w:p>
+        </w:tc>
+        <w:tc>
+          <w:tcPr>
+            <w:tcW w:type="dxa" w:w="1098"/>
+          </w:tcPr>
+          <w:p>
+            <w:pPr>
+              <w:jc w:val="center"/>
+            </w:pPr>
+            <w:r>
+              <w:rPr>
+                <w:rFonts w:ascii="Microsoft YaHei" w:hAnsi="Microsoft YaHei" w:eastAsia="Microsoft YaHei"/>
+                <w:b/>
+                <w:sz w:val="16"/>
+              </w:rPr>
+              <w:t>检索耗时</w:t>
+            </w:r>
+          </w:p>
+        </w:tc>
+        <w:tc>
+          <w:tcPr>
+            <w:tcW w:type="dxa" w:w="1098"/>
+          </w:tcPr>
+          <w:p>
+            <w:pPr>
+              <w:jc w:val="center"/>
+            </w:pPr>
+            <w:r>
+              <w:rPr>
+                <w:rFonts w:ascii="Microsoft YaHei" w:hAnsi="Microsoft YaHei" w:eastAsia="Microsoft YaHei"/>
+                <w:b/>
+                <w:sz w:val="16"/>
+              </w:rPr>
+              <w:t>生成耗时</w:t>
+            </w:r>
+          </w:p>
+        </w:tc>
+        <w:tc>
+          <w:tcPr>
+            <w:tcW w:type="dxa" w:w="1098"/>
+          </w:tcPr>
+          <w:p>
+            <w:pPr>
+              <w:jc w:val="center"/>
+            </w:pPr>
+            <w:r>
+              <w:rPr>
+                <w:rFonts w:ascii="Microsoft YaHei" w:hAnsi="Microsoft YaHei" w:eastAsia="Microsoft YaHei"/>
+                <w:b/>
+                <w:sz w:val="16"/>
+              </w:rPr>
+              <w:t>总耗时</w:t>
+            </w:r>
+          </w:p>
+        </w:tc>
+      </w:tr>
+      <w:tr>
+        <w:tc>
+          <w:tcPr>
+            <w:tcW w:type="dxa" w:w="1098"/>
+          </w:tcPr>
+          <w:p>
+            <w:pPr>
+              <w:jc w:val="center"/>
+            </w:pPr>
+            <w:r>
+              <w:rPr>
+                <w:rFonts w:ascii="Microsoft YaHei" w:hAnsi="Microsoft YaHei" w:eastAsia="Microsoft YaHei"/>
+                <w:b w:val="0"/>
+                <w:sz w:val="16"/>
+              </w:rPr>
+              <w:t>vector</w:t>
+            </w:r>
+          </w:p>
+        </w:tc>
+        <w:tc>
+          <w:tcPr>
+            <w:tcW w:type="dxa" w:w="1098"/>
+          </w:tcPr>
+          <w:p>
+            <w:pPr>
+              <w:jc w:val="center"/>
+            </w:pPr>
+            <w:r>
+              <w:rPr>
+                <w:rFonts w:ascii="Microsoft YaHei" w:hAnsi="Microsoft YaHei" w:eastAsia="Microsoft YaHei"/>
+                <w:b w:val="0"/>
+                <w:sz w:val="16"/>
+              </w:rPr>
+              <w:t>30</w:t>
+            </w:r>
+          </w:p>
+        </w:tc>
+        <w:tc>
+          <w:tcPr>
+            <w:tcW w:type="dxa" w:w="1098"/>
+          </w:tcPr>
+          <w:p>
+            <w:pPr>
+              <w:jc w:val="center"/>
+            </w:pPr>
+            <w:r>
+              <w:rPr>
+                <w:rFonts w:ascii="Microsoft YaHei" w:hAnsi="Microsoft YaHei" w:eastAsia="Microsoft YaHei"/>
+                <w:b w:val="0"/>
+                <w:sz w:val="16"/>
+              </w:rPr>
+              <w:t>1.0000</w:t>
+            </w:r>
+          </w:p>
+        </w:tc>
+        <w:tc>
+          <w:tcPr>
+            <w:tcW w:type="dxa" w:w="1098"/>
+          </w:tcPr>
+          <w:p>
+            <w:pPr>
+              <w:jc w:val="center"/>
+            </w:pPr>
+            <w:r>
+              <w:rPr>
+                <w:rFonts w:ascii="Microsoft YaHei" w:hAnsi="Microsoft YaHei" w:eastAsia="Microsoft YaHei"/>
+                <w:b w:val="0"/>
+                <w:sz w:val="16"/>
+              </w:rPr>
+              <w:t>0.7000</w:t>
+            </w:r>
+          </w:p>
+        </w:tc>
+        <w:tc>
+          <w:tcPr>
+            <w:tcW w:type="dxa" w:w="1098"/>
+          </w:tcPr>
+          <w:p>
+            <w:pPr>
+              <w:jc w:val="center"/>
+            </w:pPr>
+            <w:r>
+              <w:rPr>
+                <w:rFonts w:ascii="Microsoft YaHei" w:hAnsi="Microsoft YaHei" w:eastAsia="Microsoft YaHei"/>
+                <w:b w:val="0"/>
+                <w:sz w:val="16"/>
+              </w:rPr>
+              <w:t>0.4076</w:t>
+            </w:r>
+          </w:p>
+        </w:tc>
+        <w:tc>
+          <w:tcPr>
+            <w:tcW w:type="dxa" w:w="1098"/>
+          </w:tcPr>
+          <w:p>
+            <w:pPr>
+              <w:jc w:val="center"/>
+            </w:pPr>
+            <w:r>
+              <w:rPr>
+                <w:rFonts w:ascii="Microsoft YaHei" w:hAnsi="Microsoft YaHei" w:eastAsia="Microsoft YaHei"/>
+                <w:b w:val="0"/>
+                <w:sz w:val="16"/>
+              </w:rPr>
+              <w:t>0.4339s</w:t>
+            </w:r>
+          </w:p>
+        </w:tc>
+        <w:tc>
+          <w:tcPr>
+            <w:tcW w:type="dxa" w:w="1098"/>
+          </w:tcPr>
+          <w:p>
+            <w:pPr>
+              <w:jc w:val="center"/>
+            </w:pPr>
+            <w:r>
+              <w:rPr>
+                <w:rFonts w:ascii="Microsoft YaHei" w:hAnsi="Microsoft YaHei" w:eastAsia="Microsoft YaHei"/>
+                <w:b w:val="0"/>
+                <w:sz w:val="16"/>
+              </w:rPr>
+              <w:t>123.1658s</w:t>
+            </w:r>
+          </w:p>
+        </w:tc>
+        <w:tc>
+          <w:tcPr>
+            <w:tcW w:type="dxa" w:w="1098"/>
+          </w:tcPr>
+          <w:p>
+            <w:pPr>
+              <w:jc w:val="center"/>
+            </w:pPr>
+            <w:r>
+              <w:rPr>
+                <w:rFonts w:ascii="Microsoft YaHei" w:hAnsi="Microsoft YaHei" w:eastAsia="Microsoft YaHei"/>
+                <w:b w:val="0"/>
+                <w:sz w:val="16"/>
+              </w:rPr>
+              <w:t>123.5998s</w:t>
+            </w:r>
+          </w:p>
+        </w:tc>
+      </w:tr>
+      <w:tr>
+        <w:tc>
+          <w:tcPr>
+            <w:tcW w:type="dxa" w:w="1098"/>
+          </w:tcPr>
+          <w:p>
+            <w:pPr>
+              <w:jc w:val="center"/>
+            </w:pPr>
+            <w:r>
+              <w:rPr>
+                <w:rFonts w:ascii="Microsoft YaHei" w:hAnsi="Microsoft YaHei" w:eastAsia="Microsoft YaHei"/>
+                <w:b w:val="0"/>
+                <w:sz w:val="16"/>
+              </w:rPr>
+              <w:t>hybrid</w:t>
+            </w:r>
+          </w:p>
+        </w:tc>
+        <w:tc>
+          <w:tcPr>
+            <w:tcW w:type="dxa" w:w="1098"/>
+          </w:tcPr>
+          <w:p>
+            <w:pPr>
+              <w:jc w:val="center"/>
+            </w:pPr>
+            <w:r>
+              <w:rPr>
+                <w:rFonts w:ascii="Microsoft YaHei" w:hAnsi="Microsoft YaHei" w:eastAsia="Microsoft YaHei"/>
+                <w:b w:val="0"/>
+                <w:sz w:val="16"/>
+              </w:rPr>
+              <w:t>30</w:t>
+            </w:r>
+          </w:p>
+        </w:tc>
+        <w:tc>
+          <w:tcPr>
+            <w:tcW w:type="dxa" w:w="1098"/>
+          </w:tcPr>
+          <w:p>
+            <w:pPr>
+              <w:jc w:val="center"/>
+            </w:pPr>
+            <w:r>
+              <w:rPr>
+                <w:rFonts w:ascii="Microsoft YaHei" w:hAnsi="Microsoft YaHei" w:eastAsia="Microsoft YaHei"/>
+                <w:b w:val="0"/>
+                <w:sz w:val="16"/>
+              </w:rPr>
+              <w:t>1.0000</w:t>
+            </w:r>
+          </w:p>
+        </w:tc>
+        <w:tc>
+          <w:tcPr>
+            <w:tcW w:type="dxa" w:w="1098"/>
+          </w:tcPr>
+          <w:p>
+            <w:pPr>
+              <w:jc w:val="center"/>
+            </w:pPr>
+            <w:r>
+              <w:rPr>
+                <w:rFonts w:ascii="Microsoft YaHei" w:hAnsi="Microsoft YaHei" w:eastAsia="Microsoft YaHei"/>
+                <w:b w:val="0"/>
+                <w:sz w:val="16"/>
+              </w:rPr>
+              <w:t>1.0000</w:t>
+            </w:r>
+          </w:p>
+        </w:tc>
+        <w:tc>
+          <w:tcPr>
+            <w:tcW w:type="dxa" w:w="1098"/>
+          </w:tcPr>
+          <w:p>
+            <w:pPr>
+              <w:jc w:val="center"/>
+            </w:pPr>
+            <w:r>
+              <w:rPr>
+                <w:rFonts w:ascii="Microsoft YaHei" w:hAnsi="Microsoft YaHei" w:eastAsia="Microsoft YaHei"/>
+                <w:b w:val="0"/>
+                <w:sz w:val="16"/>
+              </w:rPr>
+              <w:t>0.6185</w:t>
+            </w:r>
+          </w:p>
+        </w:tc>
+        <w:tc>
+          <w:tcPr>
+            <w:tcW w:type="dxa" w:w="1098"/>
+          </w:tcPr>
+          <w:p>
+            <w:pPr>
+              <w:jc w:val="center"/>
+            </w:pPr>
+            <w:r>
+              <w:rPr>
+                <w:rFonts w:ascii="Microsoft YaHei" w:hAnsi="Microsoft YaHei" w:eastAsia="Microsoft YaHei"/>
+                <w:b w:val="0"/>
+                <w:sz w:val="16"/>
+              </w:rPr>
+              <w:t>0.4084s</w:t>
+            </w:r>
+          </w:p>
+        </w:tc>
+        <w:tc>
+          <w:tcPr>
+            <w:tcW w:type="dxa" w:w="1098"/>
+          </w:tcPr>
+          <w:p>
+            <w:pPr>
+              <w:jc w:val="center"/>
+            </w:pPr>
+            <w:r>
+              <w:rPr>
+                <w:rFonts w:ascii="Microsoft YaHei" w:hAnsi="Microsoft YaHei" w:eastAsia="Microsoft YaHei"/>
+                <w:b w:val="0"/>
+                <w:sz w:val="16"/>
+              </w:rPr>
+              <w:t>137.9988s</w:t>
+            </w:r>
+          </w:p>
+        </w:tc>
+        <w:tc>
+          <w:tcPr>
+            <w:tcW w:type="dxa" w:w="1098"/>
+          </w:tcPr>
+          <w:p>
+            <w:pPr>
+              <w:jc w:val="center"/>
+            </w:pPr>
+            <w:r>
+              <w:rPr>
+                <w:rFonts w:ascii="Microsoft YaHei" w:hAnsi="Microsoft YaHei" w:eastAsia="Microsoft YaHei"/>
+                <w:b w:val="0"/>
+                <w:sz w:val="16"/>
+              </w:rPr>
+              <w:t>138.4073s</w:t>
+            </w:r>
+          </w:p>
+        </w:tc>
+      </w:tr>
+    </w:tbl>
+    <w:p/>
+    <w:p>
+      <w:r>
+        <w:rPr>
+          <w:rFonts w:ascii="Microsoft YaHei" w:hAnsi="Microsoft YaHei" w:eastAsia="Microsoft YaHei"/>
+          <w:b w:val="0"/>
+          <w:sz w:val="21"/>
+        </w:rPr>
+        <w:t>两次实验都表明，hybrid 相比 vector 能明显提升检索命中率和平均参考答案覆盖度。生成耗时差异主要来自本地生成模型非确定性、运行环境负载和 Ollama 推理耗时波动，不影响控制变量设置。</w:t>
+      </w:r>
+    </w:p>
+    <w:p>
+      <w:pPr>
+        <w:pStyle w:val="Heading2"/>
+      </w:pPr>
+      <w:r>
+        <w:rPr>
+          <w:rFonts w:ascii="Microsoft YaHei" w:hAnsi="Microsoft YaHei" w:eastAsia="Microsoft YaHei"/>
+          <w:b/>
+          <w:sz w:val="24"/>
+        </w:rPr>
+        <w:t>3. 双模型对比</w:t>
+      </w:r>
+    </w:p>
+    <w:p>
+      <w:r>
+        <w:rPr>
+          <w:rFonts w:ascii="Microsoft YaHei" w:hAnsi="Microsoft YaHei" w:eastAsia="Microsoft YaHei"/>
+          <w:b w:val="0"/>
+          <w:sz w:val="21"/>
+        </w:rPr>
+        <w:t>首次完整实验结果如下：</w:t>
+      </w:r>
+    </w:p>
+    <w:tbl>
+      <w:tblPr>
+        <w:tblStyle w:val="TableGrid"/>
+        <w:tblW w:type="auto" w:w="0"/>
+        <w:tblLayout w:type="autofit"/>
+        <w:tblLook w:firstColumn="1" w:firstRow="1" w:lastColumn="0" w:lastRow="0" w:noHBand="0" w:noVBand="1" w:val="04A0"/>
+      </w:tblPr>
+      <w:tblGrid>
+        <w:gridCol w:w="1255"/>
+        <w:gridCol w:w="1255"/>
+        <w:gridCol w:w="1255"/>
+        <w:gridCol w:w="1255"/>
+        <w:gridCol w:w="1255"/>
+        <w:gridCol w:w="1255"/>
+        <w:gridCol w:w="1255"/>
+      </w:tblGrid>
+      <w:tr>
+        <w:tc>
+          <w:tcPr>
+            <w:tcW w:type="dxa" w:w="1255"/>
+          </w:tcPr>
+          <w:p>
+            <w:pPr>
+              <w:jc w:val="center"/>
+            </w:pPr>
+            <w:r>
+              <w:rPr>
+                <w:rFonts w:ascii="Microsoft YaHei" w:hAnsi="Microsoft YaHei" w:eastAsia="Microsoft YaHei"/>
+                <w:b/>
+                <w:sz w:val="16"/>
+              </w:rPr>
+              <w:t>模型</w:t>
+            </w:r>
+          </w:p>
+        </w:tc>
+        <w:tc>
+          <w:tcPr>
+            <w:tcW w:type="dxa" w:w="1255"/>
+          </w:tcPr>
+          <w:p>
+            <w:pPr>
+              <w:jc w:val="center"/>
+            </w:pPr>
+            <w:r>
+              <w:rPr>
+                <w:rFonts w:ascii="Microsoft YaHei" w:hAnsi="Microsoft YaHei" w:eastAsia="Microsoft YaHei"/>
+                <w:b/>
+                <w:sz w:val="16"/>
+              </w:rPr>
+              <w:t>样本数</w:t>
+            </w:r>
+          </w:p>
+        </w:tc>
+        <w:tc>
+          <w:tcPr>
+            <w:tcW w:type="dxa" w:w="1255"/>
+          </w:tcPr>
+          <w:p>
+            <w:pPr>
+              <w:jc w:val="center"/>
+            </w:pPr>
+            <w:r>
+              <w:rPr>
+                <w:rFonts w:ascii="Microsoft YaHei" w:hAnsi="Microsoft YaHei" w:eastAsia="Microsoft YaHei"/>
+                <w:b/>
+                <w:sz w:val="16"/>
+              </w:rPr>
+              <w:t>成功数</w:t>
+            </w:r>
+          </w:p>
+        </w:tc>
+        <w:tc>
+          <w:tcPr>
+            <w:tcW w:type="dxa" w:w="1255"/>
+          </w:tcPr>
+          <w:p>
+            <w:pPr>
+              <w:jc w:val="center"/>
+            </w:pPr>
+            <w:r>
+              <w:rPr>
+                <w:rFonts w:ascii="Microsoft YaHei" w:hAnsi="Microsoft YaHei" w:eastAsia="Microsoft YaHei"/>
+                <w:b/>
+                <w:sz w:val="16"/>
+              </w:rPr>
+              <w:t>成功率</w:t>
+            </w:r>
+          </w:p>
+        </w:tc>
+        <w:tc>
+          <w:tcPr>
+            <w:tcW w:type="dxa" w:w="1255"/>
+          </w:tcPr>
+          <w:p>
+            <w:pPr>
+              <w:jc w:val="center"/>
+            </w:pPr>
+            <w:r>
+              <w:rPr>
+                <w:rFonts w:ascii="Microsoft YaHei" w:hAnsi="Microsoft YaHei" w:eastAsia="Microsoft YaHei"/>
+                <w:b/>
+                <w:sz w:val="16"/>
+              </w:rPr>
+              <w:t>命中率</w:t>
+            </w:r>
+          </w:p>
+        </w:tc>
+        <w:tc>
+          <w:tcPr>
+            <w:tcW w:type="dxa" w:w="1255"/>
+          </w:tcPr>
+          <w:p>
+            <w:pPr>
+              <w:jc w:val="center"/>
+            </w:pPr>
+            <w:r>
+              <w:rPr>
+                <w:rFonts w:ascii="Microsoft YaHei" w:hAnsi="Microsoft YaHei" w:eastAsia="Microsoft YaHei"/>
+                <w:b/>
+                <w:sz w:val="16"/>
+              </w:rPr>
+              <w:t>平均覆盖度</w:t>
+            </w:r>
+          </w:p>
+        </w:tc>
+        <w:tc>
+          <w:tcPr>
+            <w:tcW w:type="dxa" w:w="1255"/>
+          </w:tcPr>
+          <w:p>
+            <w:pPr>
+              <w:jc w:val="center"/>
+            </w:pPr>
+            <w:r>
+              <w:rPr>
+                <w:rFonts w:ascii="Microsoft YaHei" w:hAnsi="Microsoft YaHei" w:eastAsia="Microsoft YaHei"/>
+                <w:b/>
+                <w:sz w:val="16"/>
+              </w:rPr>
+              <w:t>总耗时</w:t>
+            </w:r>
+          </w:p>
+        </w:tc>
+      </w:tr>
+      <w:tr>
+        <w:tc>
+          <w:tcPr>
+            <w:tcW w:type="dxa" w:w="1255"/>
+          </w:tcPr>
+          <w:p>
+            <w:pPr>
+              <w:jc w:val="center"/>
+            </w:pPr>
+            <w:r>
+              <w:rPr>
+                <w:rFonts w:ascii="Microsoft YaHei" w:hAnsi="Microsoft YaHei" w:eastAsia="Microsoft YaHei"/>
+                <w:b w:val="0"/>
+                <w:sz w:val="16"/>
+              </w:rPr>
+              <w:t>deepseek-r1:7b-qwen-distill-q4_K_M</w:t>
+            </w:r>
+          </w:p>
+        </w:tc>
+        <w:tc>
+          <w:tcPr>
+            <w:tcW w:type="dxa" w:w="1255"/>
+          </w:tcPr>
+          <w:p>
+            <w:pPr>
+              <w:jc w:val="center"/>
+            </w:pPr>
+            <w:r>
+              <w:rPr>
+                <w:rFonts w:ascii="Microsoft YaHei" w:hAnsi="Microsoft YaHei" w:eastAsia="Microsoft YaHei"/>
+                <w:b w:val="0"/>
+                <w:sz w:val="16"/>
+              </w:rPr>
+              <w:t>30</w:t>
+            </w:r>
+          </w:p>
+        </w:tc>
+        <w:tc>
+          <w:tcPr>
+            <w:tcW w:type="dxa" w:w="1255"/>
+          </w:tcPr>
+          <w:p>
+            <w:pPr>
+              <w:jc w:val="center"/>
+            </w:pPr>
+            <w:r>
+              <w:rPr>
+                <w:rFonts w:ascii="Microsoft YaHei" w:hAnsi="Microsoft YaHei" w:eastAsia="Microsoft YaHei"/>
+                <w:b w:val="0"/>
+                <w:sz w:val="16"/>
+              </w:rPr>
+              <w:t>30</w:t>
+            </w:r>
+          </w:p>
+        </w:tc>
+        <w:tc>
+          <w:tcPr>
+            <w:tcW w:type="dxa" w:w="1255"/>
+          </w:tcPr>
+          <w:p>
+            <w:pPr>
+              <w:jc w:val="center"/>
+            </w:pPr>
+            <w:r>
+              <w:rPr>
+                <w:rFonts w:ascii="Microsoft YaHei" w:hAnsi="Microsoft YaHei" w:eastAsia="Microsoft YaHei"/>
+                <w:b w:val="0"/>
+                <w:sz w:val="16"/>
+              </w:rPr>
+              <w:t>1.0000</w:t>
+            </w:r>
+          </w:p>
+        </w:tc>
+        <w:tc>
+          <w:tcPr>
+            <w:tcW w:type="dxa" w:w="1255"/>
+          </w:tcPr>
+          <w:p>
+            <w:pPr>
+              <w:jc w:val="center"/>
+            </w:pPr>
+            <w:r>
+              <w:rPr>
+                <w:rFonts w:ascii="Microsoft YaHei" w:hAnsi="Microsoft YaHei" w:eastAsia="Microsoft YaHei"/>
+                <w:b w:val="0"/>
+                <w:sz w:val="16"/>
+              </w:rPr>
+              <w:t>1.0000</w:t>
+            </w:r>
+          </w:p>
+        </w:tc>
+        <w:tc>
+          <w:tcPr>
+            <w:tcW w:type="dxa" w:w="1255"/>
+          </w:tcPr>
+          <w:p>
+            <w:pPr>
+              <w:jc w:val="center"/>
+            </w:pPr>
+            <w:r>
+              <w:rPr>
+                <w:rFonts w:ascii="Microsoft YaHei" w:hAnsi="Microsoft YaHei" w:eastAsia="Microsoft YaHei"/>
+                <w:b w:val="0"/>
+                <w:sz w:val="16"/>
+              </w:rPr>
+              <w:t>0.4324</w:t>
+            </w:r>
+          </w:p>
+        </w:tc>
+        <w:tc>
+          <w:tcPr>
+            <w:tcW w:type="dxa" w:w="1255"/>
+          </w:tcPr>
+          <w:p>
+            <w:pPr>
+              <w:jc w:val="center"/>
+            </w:pPr>
+            <w:r>
+              <w:rPr>
+                <w:rFonts w:ascii="Microsoft YaHei" w:hAnsi="Microsoft YaHei" w:eastAsia="Microsoft YaHei"/>
+                <w:b w:val="0"/>
+                <w:sz w:val="16"/>
+              </w:rPr>
+              <w:t>171.2024s</w:t>
+            </w:r>
+          </w:p>
+        </w:tc>
+      </w:tr>
+      <w:tr>
+        <w:tc>
+          <w:tcPr>
+            <w:tcW w:type="dxa" w:w="1255"/>
+          </w:tcPr>
+          <w:p>
+            <w:pPr>
+              <w:jc w:val="center"/>
+            </w:pPr>
+            <w:r>
+              <w:rPr>
+                <w:rFonts w:ascii="Microsoft YaHei" w:hAnsi="Microsoft YaHei" w:eastAsia="Microsoft YaHei"/>
+                <w:b w:val="0"/>
+                <w:sz w:val="16"/>
+              </w:rPr>
+              <w:t>qwen2.5:7b-instruct-q4_K_M</w:t>
+            </w:r>
+          </w:p>
+        </w:tc>
+        <w:tc>
+          <w:tcPr>
+            <w:tcW w:type="dxa" w:w="1255"/>
+          </w:tcPr>
+          <w:p>
+            <w:pPr>
+              <w:jc w:val="center"/>
+            </w:pPr>
+            <w:r>
+              <w:rPr>
+                <w:rFonts w:ascii="Microsoft YaHei" w:hAnsi="Microsoft YaHei" w:eastAsia="Microsoft YaHei"/>
+                <w:b w:val="0"/>
+                <w:sz w:val="16"/>
+              </w:rPr>
+              <w:t>30</w:t>
+            </w:r>
+          </w:p>
+        </w:tc>
+        <w:tc>
+          <w:tcPr>
+            <w:tcW w:type="dxa" w:w="1255"/>
+          </w:tcPr>
+          <w:p>
+            <w:pPr>
+              <w:jc w:val="center"/>
+            </w:pPr>
+            <w:r>
+              <w:rPr>
+                <w:rFonts w:ascii="Microsoft YaHei" w:hAnsi="Microsoft YaHei" w:eastAsia="Microsoft YaHei"/>
+                <w:b w:val="0"/>
+                <w:sz w:val="16"/>
+              </w:rPr>
+              <w:t>30</w:t>
+            </w:r>
+          </w:p>
+        </w:tc>
+        <w:tc>
+          <w:tcPr>
+            <w:tcW w:type="dxa" w:w="1255"/>
+          </w:tcPr>
+          <w:p>
+            <w:pPr>
+              <w:jc w:val="center"/>
+            </w:pPr>
+            <w:r>
+              <w:rPr>
+                <w:rFonts w:ascii="Microsoft YaHei" w:hAnsi="Microsoft YaHei" w:eastAsia="Microsoft YaHei"/>
+                <w:b w:val="0"/>
+                <w:sz w:val="16"/>
+              </w:rPr>
+              <w:t>1.0000</w:t>
+            </w:r>
+          </w:p>
+        </w:tc>
+        <w:tc>
+          <w:tcPr>
+            <w:tcW w:type="dxa" w:w="1255"/>
+          </w:tcPr>
+          <w:p>
+            <w:pPr>
+              <w:jc w:val="center"/>
+            </w:pPr>
+            <w:r>
+              <w:rPr>
+                <w:rFonts w:ascii="Microsoft YaHei" w:hAnsi="Microsoft YaHei" w:eastAsia="Microsoft YaHei"/>
+                <w:b w:val="0"/>
+                <w:sz w:val="16"/>
+              </w:rPr>
+              <w:t>1.0000</w:t>
+            </w:r>
+          </w:p>
+        </w:tc>
+        <w:tc>
+          <w:tcPr>
+            <w:tcW w:type="dxa" w:w="1255"/>
+          </w:tcPr>
+          <w:p>
+            <w:pPr>
+              <w:jc w:val="center"/>
+            </w:pPr>
+            <w:r>
+              <w:rPr>
+                <w:rFonts w:ascii="Microsoft YaHei" w:hAnsi="Microsoft YaHei" w:eastAsia="Microsoft YaHei"/>
+                <w:b w:val="0"/>
+                <w:sz w:val="16"/>
+              </w:rPr>
+              <w:t>0.5746</w:t>
+            </w:r>
+          </w:p>
+        </w:tc>
+        <w:tc>
+          <w:tcPr>
+            <w:tcW w:type="dxa" w:w="1255"/>
+          </w:tcPr>
+          <w:p>
+            <w:pPr>
+              <w:jc w:val="center"/>
+            </w:pPr>
+            <w:r>
+              <w:rPr>
+                <w:rFonts w:ascii="Microsoft YaHei" w:hAnsi="Microsoft YaHei" w:eastAsia="Microsoft YaHei"/>
+                <w:b w:val="0"/>
+                <w:sz w:val="16"/>
+              </w:rPr>
+              <w:t>143.3015s</w:t>
+            </w:r>
+          </w:p>
+        </w:tc>
+      </w:tr>
+    </w:tbl>
+    <w:p/>
+    <w:p>
+      <w:r>
+        <w:rPr>
+          <w:rFonts w:ascii="Microsoft YaHei" w:hAnsi="Microsoft YaHei" w:eastAsia="Microsoft YaHei"/>
+          <w:b w:val="0"/>
+          <w:sz w:val="21"/>
+        </w:rPr>
+        <w:t>重新完整流程实验结果（2026-05-23）如下：</w:t>
+      </w:r>
+    </w:p>
+    <w:tbl>
+      <w:tblPr>
+        <w:tblStyle w:val="TableGrid"/>
+        <w:tblW w:type="auto" w:w="0"/>
+        <w:tblLayout w:type="autofit"/>
+        <w:tblLook w:firstColumn="1" w:firstRow="1" w:lastColumn="0" w:lastRow="0" w:noHBand="0" w:noVBand="1" w:val="04A0"/>
+      </w:tblPr>
+      <w:tblGrid>
+        <w:gridCol w:w="976"/>
+        <w:gridCol w:w="976"/>
+        <w:gridCol w:w="976"/>
+        <w:gridCol w:w="976"/>
+        <w:gridCol w:w="976"/>
+        <w:gridCol w:w="976"/>
+        <w:gridCol w:w="976"/>
+        <w:gridCol w:w="976"/>
+        <w:gridCol w:w="976"/>
+      </w:tblGrid>
+      <w:tr>
+        <w:tc>
+          <w:tcPr>
+            <w:tcW w:type="dxa" w:w="976"/>
+          </w:tcPr>
+          <w:p>
+            <w:pPr>
+              <w:jc w:val="center"/>
+            </w:pPr>
+            <w:r>
+              <w:rPr>
+                <w:rFonts w:ascii="Microsoft YaHei" w:hAnsi="Microsoft YaHei" w:eastAsia="Microsoft YaHei"/>
+                <w:b/>
+                <w:sz w:val="16"/>
+              </w:rPr>
+              <w:t>模型</w:t>
+            </w:r>
+          </w:p>
+        </w:tc>
+        <w:tc>
+          <w:tcPr>
+            <w:tcW w:type="dxa" w:w="976"/>
+          </w:tcPr>
+          <w:p>
+            <w:pPr>
+              <w:jc w:val="center"/>
+            </w:pPr>
+            <w:r>
+              <w:rPr>
+                <w:rFonts w:ascii="Microsoft YaHei" w:hAnsi="Microsoft YaHei" w:eastAsia="Microsoft YaHei"/>
+                <w:b/>
+                <w:sz w:val="16"/>
+              </w:rPr>
+              <w:t>样本数</w:t>
+            </w:r>
+          </w:p>
+        </w:tc>
+        <w:tc>
+          <w:tcPr>
+            <w:tcW w:type="dxa" w:w="976"/>
+          </w:tcPr>
+          <w:p>
+            <w:pPr>
+              <w:jc w:val="center"/>
+            </w:pPr>
+            <w:r>
+              <w:rPr>
+                <w:rFonts w:ascii="Microsoft YaHei" w:hAnsi="Microsoft YaHei" w:eastAsia="Microsoft YaHei"/>
+                <w:b/>
+                <w:sz w:val="16"/>
+              </w:rPr>
+              <w:t>成功数</w:t>
+            </w:r>
+          </w:p>
+        </w:tc>
+        <w:tc>
+          <w:tcPr>
+            <w:tcW w:type="dxa" w:w="976"/>
+          </w:tcPr>
+          <w:p>
+            <w:pPr>
+              <w:jc w:val="center"/>
+            </w:pPr>
+            <w:r>
+              <w:rPr>
+                <w:rFonts w:ascii="Microsoft YaHei" w:hAnsi="Microsoft YaHei" w:eastAsia="Microsoft YaHei"/>
+                <w:b/>
+                <w:sz w:val="16"/>
+              </w:rPr>
+              <w:t>成功率</w:t>
+            </w:r>
+          </w:p>
+        </w:tc>
+        <w:tc>
+          <w:tcPr>
+            <w:tcW w:type="dxa" w:w="976"/>
+          </w:tcPr>
+          <w:p>
+            <w:pPr>
+              <w:jc w:val="center"/>
+            </w:pPr>
+            <w:r>
+              <w:rPr>
+                <w:rFonts w:ascii="Microsoft YaHei" w:hAnsi="Microsoft YaHei" w:eastAsia="Microsoft YaHei"/>
+                <w:b/>
+                <w:sz w:val="16"/>
+              </w:rPr>
+              <w:t>命中率</w:t>
+            </w:r>
+          </w:p>
+        </w:tc>
+        <w:tc>
+          <w:tcPr>
+            <w:tcW w:type="dxa" w:w="976"/>
+          </w:tcPr>
+          <w:p>
+            <w:pPr>
+              <w:jc w:val="center"/>
+            </w:pPr>
+            <w:r>
+              <w:rPr>
+                <w:rFonts w:ascii="Microsoft YaHei" w:hAnsi="Microsoft YaHei" w:eastAsia="Microsoft YaHei"/>
+                <w:b/>
+                <w:sz w:val="16"/>
+              </w:rPr>
+              <w:t>平均覆盖度</w:t>
+            </w:r>
+          </w:p>
+        </w:tc>
+        <w:tc>
+          <w:tcPr>
+            <w:tcW w:type="dxa" w:w="976"/>
+          </w:tcPr>
+          <w:p>
+            <w:pPr>
+              <w:jc w:val="center"/>
+            </w:pPr>
+            <w:r>
+              <w:rPr>
+                <w:rFonts w:ascii="Microsoft YaHei" w:hAnsi="Microsoft YaHei" w:eastAsia="Microsoft YaHei"/>
+                <w:b/>
+                <w:sz w:val="16"/>
+              </w:rPr>
+              <w:t>检索耗时</w:t>
+            </w:r>
+          </w:p>
+        </w:tc>
+        <w:tc>
+          <w:tcPr>
+            <w:tcW w:type="dxa" w:w="976"/>
+          </w:tcPr>
+          <w:p>
+            <w:pPr>
+              <w:jc w:val="center"/>
+            </w:pPr>
+            <w:r>
+              <w:rPr>
+                <w:rFonts w:ascii="Microsoft YaHei" w:hAnsi="Microsoft YaHei" w:eastAsia="Microsoft YaHei"/>
+                <w:b/>
+                <w:sz w:val="16"/>
+              </w:rPr>
+              <w:t>生成耗时</w:t>
+            </w:r>
+          </w:p>
+        </w:tc>
+        <w:tc>
+          <w:tcPr>
+            <w:tcW w:type="dxa" w:w="976"/>
+          </w:tcPr>
+          <w:p>
+            <w:pPr>
+              <w:jc w:val="center"/>
+            </w:pPr>
+            <w:r>
+              <w:rPr>
+                <w:rFonts w:ascii="Microsoft YaHei" w:hAnsi="Microsoft YaHei" w:eastAsia="Microsoft YaHei"/>
+                <w:b/>
+                <w:sz w:val="16"/>
+              </w:rPr>
+              <w:t>总耗时</w:t>
+            </w:r>
+          </w:p>
+        </w:tc>
+      </w:tr>
+      <w:tr>
+        <w:tc>
+          <w:tcPr>
+            <w:tcW w:type="dxa" w:w="976"/>
+          </w:tcPr>
+          <w:p>
+            <w:pPr>
+              <w:jc w:val="center"/>
+            </w:pPr>
+            <w:r>
+              <w:rPr>
+                <w:rFonts w:ascii="Microsoft YaHei" w:hAnsi="Microsoft YaHei" w:eastAsia="Microsoft YaHei"/>
+                <w:b w:val="0"/>
+                <w:sz w:val="16"/>
+              </w:rPr>
+              <w:t>deepseek-r1:7b-qwen-distill-q4_K_M</w:t>
+            </w:r>
+          </w:p>
+        </w:tc>
+        <w:tc>
+          <w:tcPr>
+            <w:tcW w:type="dxa" w:w="976"/>
+          </w:tcPr>
+          <w:p>
+            <w:pPr>
+              <w:jc w:val="center"/>
+            </w:pPr>
+            <w:r>
+              <w:rPr>
+                <w:rFonts w:ascii="Microsoft YaHei" w:hAnsi="Microsoft YaHei" w:eastAsia="Microsoft YaHei"/>
+                <w:b w:val="0"/>
+                <w:sz w:val="16"/>
+              </w:rPr>
+              <w:t>30</w:t>
+            </w:r>
+          </w:p>
+        </w:tc>
+        <w:tc>
+          <w:tcPr>
+            <w:tcW w:type="dxa" w:w="976"/>
+          </w:tcPr>
+          <w:p>
+            <w:pPr>
+              <w:jc w:val="center"/>
+            </w:pPr>
+            <w:r>
+              <w:rPr>
+                <w:rFonts w:ascii="Microsoft YaHei" w:hAnsi="Microsoft YaHei" w:eastAsia="Microsoft YaHei"/>
+                <w:b w:val="0"/>
+                <w:sz w:val="16"/>
+              </w:rPr>
+              <w:t>30</w:t>
+            </w:r>
+          </w:p>
+        </w:tc>
+        <w:tc>
+          <w:tcPr>
+            <w:tcW w:type="dxa" w:w="976"/>
+          </w:tcPr>
+          <w:p>
+            <w:pPr>
+              <w:jc w:val="center"/>
+            </w:pPr>
+            <w:r>
+              <w:rPr>
+                <w:rFonts w:ascii="Microsoft YaHei" w:hAnsi="Microsoft YaHei" w:eastAsia="Microsoft YaHei"/>
+                <w:b w:val="0"/>
+                <w:sz w:val="16"/>
+              </w:rPr>
+              <w:t>1.0000</w:t>
+            </w:r>
+          </w:p>
+        </w:tc>
+        <w:tc>
+          <w:tcPr>
+            <w:tcW w:type="dxa" w:w="976"/>
+          </w:tcPr>
+          <w:p>
+            <w:pPr>
+              <w:jc w:val="center"/>
+            </w:pPr>
+            <w:r>
+              <w:rPr>
+                <w:rFonts w:ascii="Microsoft YaHei" w:hAnsi="Microsoft YaHei" w:eastAsia="Microsoft YaHei"/>
+                <w:b w:val="0"/>
+                <w:sz w:val="16"/>
+              </w:rPr>
+              <w:t>1.0000</w:t>
+            </w:r>
+          </w:p>
+        </w:tc>
+        <w:tc>
+          <w:tcPr>
+            <w:tcW w:type="dxa" w:w="976"/>
+          </w:tcPr>
+          <w:p>
+            <w:pPr>
+              <w:jc w:val="center"/>
+            </w:pPr>
+            <w:r>
+              <w:rPr>
+                <w:rFonts w:ascii="Microsoft YaHei" w:hAnsi="Microsoft YaHei" w:eastAsia="Microsoft YaHei"/>
+                <w:b w:val="0"/>
+                <w:sz w:val="16"/>
+              </w:rPr>
+              <w:t>0.4765</w:t>
+            </w:r>
+          </w:p>
+        </w:tc>
+        <w:tc>
+          <w:tcPr>
+            <w:tcW w:type="dxa" w:w="976"/>
+          </w:tcPr>
+          <w:p>
+            <w:pPr>
+              <w:jc w:val="center"/>
+            </w:pPr>
+            <w:r>
+              <w:rPr>
+                <w:rFonts w:ascii="Microsoft YaHei" w:hAnsi="Microsoft YaHei" w:eastAsia="Microsoft YaHei"/>
+                <w:b w:val="0"/>
+                <w:sz w:val="16"/>
+              </w:rPr>
+              <w:t>0.4563s</w:t>
+            </w:r>
+          </w:p>
+        </w:tc>
+        <w:tc>
+          <w:tcPr>
+            <w:tcW w:type="dxa" w:w="976"/>
+          </w:tcPr>
+          <w:p>
+            <w:pPr>
+              <w:jc w:val="center"/>
+            </w:pPr>
+            <w:r>
+              <w:rPr>
+                <w:rFonts w:ascii="Microsoft YaHei" w:hAnsi="Microsoft YaHei" w:eastAsia="Microsoft YaHei"/>
+                <w:b w:val="0"/>
+                <w:sz w:val="16"/>
+              </w:rPr>
+              <w:t>165.0030s</w:t>
+            </w:r>
+          </w:p>
+        </w:tc>
+        <w:tc>
+          <w:tcPr>
+            <w:tcW w:type="dxa" w:w="976"/>
+          </w:tcPr>
+          <w:p>
+            <w:pPr>
+              <w:jc w:val="center"/>
+            </w:pPr>
+            <w:r>
+              <w:rPr>
+                <w:rFonts w:ascii="Microsoft YaHei" w:hAnsi="Microsoft YaHei" w:eastAsia="Microsoft YaHei"/>
+                <w:b w:val="0"/>
+                <w:sz w:val="16"/>
+              </w:rPr>
+              <w:t>165.4594s</w:t>
+            </w:r>
+          </w:p>
+        </w:tc>
+      </w:tr>
+      <w:tr>
+        <w:tc>
+          <w:tcPr>
+            <w:tcW w:type="dxa" w:w="976"/>
+          </w:tcPr>
+          <w:p>
+            <w:pPr>
+              <w:jc w:val="center"/>
+            </w:pPr>
+            <w:r>
+              <w:rPr>
+                <w:rFonts w:ascii="Microsoft YaHei" w:hAnsi="Microsoft YaHei" w:eastAsia="Microsoft YaHei"/>
+                <w:b w:val="0"/>
+                <w:sz w:val="16"/>
+              </w:rPr>
+              <w:t>qwen2.5:7b-instruct-q4_K_M</w:t>
+            </w:r>
+          </w:p>
+        </w:tc>
+        <w:tc>
+          <w:tcPr>
+            <w:tcW w:type="dxa" w:w="976"/>
+          </w:tcPr>
+          <w:p>
+            <w:pPr>
+              <w:jc w:val="center"/>
+            </w:pPr>
+            <w:r>
+              <w:rPr>
+                <w:rFonts w:ascii="Microsoft YaHei" w:hAnsi="Microsoft YaHei" w:eastAsia="Microsoft YaHei"/>
+                <w:b w:val="0"/>
+                <w:sz w:val="16"/>
+              </w:rPr>
+              <w:t>30</w:t>
+            </w:r>
+          </w:p>
+        </w:tc>
+        <w:tc>
+          <w:tcPr>
+            <w:tcW w:type="dxa" w:w="976"/>
+          </w:tcPr>
+          <w:p>
+            <w:pPr>
+              <w:jc w:val="center"/>
+            </w:pPr>
+            <w:r>
+              <w:rPr>
+                <w:rFonts w:ascii="Microsoft YaHei" w:hAnsi="Microsoft YaHei" w:eastAsia="Microsoft YaHei"/>
+                <w:b w:val="0"/>
+                <w:sz w:val="16"/>
+              </w:rPr>
+              <w:t>30</w:t>
+            </w:r>
+          </w:p>
+        </w:tc>
+        <w:tc>
+          <w:tcPr>
+            <w:tcW w:type="dxa" w:w="976"/>
+          </w:tcPr>
+          <w:p>
+            <w:pPr>
+              <w:jc w:val="center"/>
+            </w:pPr>
+            <w:r>
+              <w:rPr>
+                <w:rFonts w:ascii="Microsoft YaHei" w:hAnsi="Microsoft YaHei" w:eastAsia="Microsoft YaHei"/>
+                <w:b w:val="0"/>
+                <w:sz w:val="16"/>
+              </w:rPr>
+              <w:t>1.0000</w:t>
+            </w:r>
+          </w:p>
+        </w:tc>
+        <w:tc>
+          <w:tcPr>
+            <w:tcW w:type="dxa" w:w="976"/>
+          </w:tcPr>
+          <w:p>
+            <w:pPr>
+              <w:jc w:val="center"/>
+            </w:pPr>
+            <w:r>
+              <w:rPr>
+                <w:rFonts w:ascii="Microsoft YaHei" w:hAnsi="Microsoft YaHei" w:eastAsia="Microsoft YaHei"/>
+                <w:b w:val="0"/>
+                <w:sz w:val="16"/>
+              </w:rPr>
+              <w:t>1.0000</w:t>
+            </w:r>
+          </w:p>
+        </w:tc>
+        <w:tc>
+          <w:tcPr>
+            <w:tcW w:type="dxa" w:w="976"/>
+          </w:tcPr>
+          <w:p>
+            <w:pPr>
+              <w:jc w:val="center"/>
+            </w:pPr>
+            <w:r>
+              <w:rPr>
+                <w:rFonts w:ascii="Microsoft YaHei" w:hAnsi="Microsoft YaHei" w:eastAsia="Microsoft YaHei"/>
+                <w:b w:val="0"/>
+                <w:sz w:val="16"/>
+              </w:rPr>
+              <w:t>0.6205</w:t>
+            </w:r>
+          </w:p>
+        </w:tc>
+        <w:tc>
+          <w:tcPr>
+            <w:tcW w:type="dxa" w:w="976"/>
+          </w:tcPr>
+          <w:p>
+            <w:pPr>
+              <w:jc w:val="center"/>
+            </w:pPr>
+            <w:r>
+              <w:rPr>
+                <w:rFonts w:ascii="Microsoft YaHei" w:hAnsi="Microsoft YaHei" w:eastAsia="Microsoft YaHei"/>
+                <w:b w:val="0"/>
+                <w:sz w:val="16"/>
+              </w:rPr>
+              <w:t>0.4582s</w:t>
+            </w:r>
+          </w:p>
+        </w:tc>
+        <w:tc>
+          <w:tcPr>
+            <w:tcW w:type="dxa" w:w="976"/>
+          </w:tcPr>
+          <w:p>
+            <w:pPr>
+              <w:jc w:val="center"/>
+            </w:pPr>
+            <w:r>
+              <w:rPr>
+                <w:rFonts w:ascii="Microsoft YaHei" w:hAnsi="Microsoft YaHei" w:eastAsia="Microsoft YaHei"/>
+                <w:b w:val="0"/>
+                <w:sz w:val="16"/>
+              </w:rPr>
+              <w:t>138.7100s</w:t>
+            </w:r>
+          </w:p>
+        </w:tc>
+        <w:tc>
+          <w:tcPr>
+            <w:tcW w:type="dxa" w:w="976"/>
+          </w:tcPr>
+          <w:p>
+            <w:pPr>
+              <w:jc w:val="center"/>
+            </w:pPr>
+            <w:r>
+              <w:rPr>
+                <w:rFonts w:ascii="Microsoft YaHei" w:hAnsi="Microsoft YaHei" w:eastAsia="Microsoft YaHei"/>
+                <w:b w:val="0"/>
+                <w:sz w:val="16"/>
+              </w:rPr>
+              <w:t>139.1683s</w:t>
+            </w:r>
+          </w:p>
+        </w:tc>
+      </w:tr>
+    </w:tbl>
+    <w:p/>
+    <w:p>
+      <w:r>
+        <w:rPr>
+          <w:rFonts w:ascii="Microsoft YaHei" w:hAnsi="Microsoft YaHei" w:eastAsia="Microsoft YaHei"/>
+          <w:b w:val="0"/>
+          <w:sz w:val="21"/>
+        </w:rPr>
+        <w:t>两组双模型结果均显示，Qwen 的平均参考答案覆盖度更高、平均总耗时更短，更适合作为当前项目默认问答模型。</w:t>
+      </w:r>
+    </w:p>
     <w:sectPr>
       <w:footerReference w:type="default" r:id="rId9"/>
       <w:pgSz w:w="11906" w:h="16838"/>

</xml_diff>